<commit_message>
test: transliterate fixtures to latin and remove unnecessary text
</commit_message>
<xml_diff>
--- a/tests/fixtures/baza/odgovori/ndo/1.docx
+++ b/tests/fixtures/baza/odgovori/ndo/1.docx
@@ -34,16 +34,6 @@
             <w:bookmarkStart w:id="0" w:name="_Toc53830452"/>
             <w:bookmarkStart w:id="1" w:name="_Toc184401933"/>
             <w:bookmarkStart w:id="2" w:name="_Toc184715163"/>
-            <w:r>
-              <w:rPr>
-                <w:rFonts w:ascii="Arial" w:hAnsi="Arial" w:cs="Arial"/>
-                <w:b/>
-                <w:i/>
-                <w:sz w:val="20"/>
-                <w:szCs w:val="20"/>
-              </w:rPr>
-              <w:t>Р. бр.</w:t>
-            </w:r>
           </w:p>
         </w:tc>
         <w:tc>
@@ -61,16 +51,6 @@
                 <w:szCs w:val="20"/>
               </w:rPr>
             </w:pPr>
-            <w:r>
-              <w:rPr>
-                <w:rFonts w:ascii="Arial" w:hAnsi="Arial" w:cs="Arial"/>
-                <w:b/>
-                <w:i/>
-                <w:sz w:val="20"/>
-                <w:szCs w:val="20"/>
-              </w:rPr>
-              <w:t>Напомена везано за питање</w:t>
-            </w:r>
           </w:p>
         </w:tc>
         <w:tc>
@@ -89,16 +69,6 @@
                 <w:szCs w:val="20"/>
               </w:rPr>
             </w:pPr>
-            <w:r>
-              <w:rPr>
-                <w:rFonts w:ascii="Arial" w:hAnsi="Arial" w:cs="Arial"/>
-                <w:b/>
-                <w:i/>
-                <w:sz w:val="20"/>
-                <w:szCs w:val="20"/>
-              </w:rPr>
-              <w:t>Поени</w:t>
-            </w:r>
           </w:p>
         </w:tc>
       </w:tr>
@@ -139,69 +109,6 @@
                 <w:i/>
               </w:rPr>
             </w:pPr>
-            <w:r>
-              <w:rPr>
-                <w:rFonts w:cs="Arial"/>
-                <w:i/>
-                <w:sz w:val="18"/>
-                <w:szCs w:val="18"/>
-              </w:rPr>
-              <w:fldChar w:fldCharType="begin">
-                <w:ffData>
-                  <w:name w:val="Check3"/>
-                  <w:enabled/>
-                  <w:calcOnExit w:val="0"/>
-                  <w:checkBox>
-                    <w:sizeAuto/>
-                    <w:default w:val="0"/>
-                  </w:checkBox>
-                </w:ffData>
-              </w:fldChar>
-            </w:r>
-            <w:r>
-              <w:rPr>
-                <w:rFonts w:ascii="Arial" w:hAnsi="Arial" w:cs="Arial"/>
-                <w:i/>
-                <w:sz w:val="18"/>
-                <w:szCs w:val="18"/>
-              </w:rPr>
-              <w:instrText xml:space="preserve"> FORMCHECKBOX </w:instrText>
-            </w:r>
-            <w:r>
-              <w:rPr>
-                <w:rFonts w:cs="Arial"/>
-                <w:i/>
-                <w:sz w:val="18"/>
-                <w:szCs w:val="18"/>
-              </w:rPr>
-            </w:r>
-            <w:r>
-              <w:rPr>
-                <w:rFonts w:cs="Arial"/>
-                <w:i/>
-                <w:sz w:val="18"/>
-                <w:szCs w:val="18"/>
-              </w:rPr>
-              <w:fldChar w:fldCharType="separate"/>
-            </w:r>
-            <w:r>
-              <w:rPr>
-                <w:rFonts w:cs="Arial"/>
-                <w:i/>
-                <w:sz w:val="18"/>
-                <w:szCs w:val="18"/>
-              </w:rPr>
-              <w:fldChar w:fldCharType="end"/>
-            </w:r>
-            <w:r>
-              <w:rPr>
-                <w:rFonts w:ascii="Arial" w:hAnsi="Arial" w:cs="Arial"/>
-                <w:i/>
-                <w:sz w:val="18"/>
-                <w:szCs w:val="18"/>
-              </w:rPr>
-              <w:t xml:space="preserve"> Одговори на постављено питање</w:t>
-            </w:r>
           </w:p>
         </w:tc>
         <w:tc>
@@ -221,16 +128,6 @@
                 <w:szCs w:val="20"/>
               </w:rPr>
             </w:pPr>
-            <w:r>
-              <w:rPr>
-                <w:rFonts w:ascii="Arial" w:hAnsi="Arial" w:cs="Arial"/>
-                <w:b/>
-                <w:i/>
-                <w:sz w:val="20"/>
-                <w:szCs w:val="20"/>
-              </w:rPr>
-              <w:t>Максимално</w:t>
-            </w:r>
           </w:p>
         </w:tc>
         <w:tc>
@@ -249,15 +146,6 @@
                 <w:szCs w:val="28"/>
               </w:rPr>
             </w:pPr>
-            <w:r>
-              <w:rPr>
-                <w:rFonts w:ascii="Arial" w:hAnsi="Arial" w:cs="Arial"/>
-                <w:b/>
-                <w:sz w:val="28"/>
-                <w:szCs w:val="28"/>
-              </w:rPr>
-              <w:t>1</w:t>
-            </w:r>
           </w:p>
         </w:tc>
       </w:tr>
@@ -287,69 +175,6 @@
                 <w:i/>
               </w:rPr>
             </w:pPr>
-            <w:r>
-              <w:rPr>
-                <w:rFonts w:cs="Arial"/>
-                <w:i/>
-                <w:sz w:val="18"/>
-                <w:szCs w:val="18"/>
-              </w:rPr>
-              <w:fldChar w:fldCharType="begin">
-                <w:ffData>
-                  <w:name w:val="Check3"/>
-                  <w:enabled/>
-                  <w:calcOnExit w:val="0"/>
-                  <w:checkBox>
-                    <w:sizeAuto/>
-                    <w:default w:val="0"/>
-                  </w:checkBox>
-                </w:ffData>
-              </w:fldChar>
-            </w:r>
-            <w:r>
-              <w:rPr>
-                <w:rFonts w:ascii="Arial" w:hAnsi="Arial" w:cs="Arial"/>
-                <w:i/>
-                <w:sz w:val="18"/>
-                <w:szCs w:val="18"/>
-              </w:rPr>
-              <w:instrText xml:space="preserve"> FORMCHECKBOX </w:instrText>
-            </w:r>
-            <w:r>
-              <w:rPr>
-                <w:rFonts w:cs="Arial"/>
-                <w:i/>
-                <w:sz w:val="18"/>
-                <w:szCs w:val="18"/>
-              </w:rPr>
-            </w:r>
-            <w:r>
-              <w:rPr>
-                <w:rFonts w:cs="Arial"/>
-                <w:i/>
-                <w:sz w:val="18"/>
-                <w:szCs w:val="18"/>
-              </w:rPr>
-              <w:fldChar w:fldCharType="separate"/>
-            </w:r>
-            <w:r>
-              <w:rPr>
-                <w:rFonts w:cs="Arial"/>
-                <w:i/>
-                <w:sz w:val="18"/>
-                <w:szCs w:val="18"/>
-              </w:rPr>
-              <w:fldChar w:fldCharType="end"/>
-            </w:r>
-            <w:r>
-              <w:rPr>
-                <w:rFonts w:ascii="Arial" w:hAnsi="Arial" w:cs="Arial"/>
-                <w:i/>
-                <w:sz w:val="18"/>
-                <w:szCs w:val="18"/>
-              </w:rPr>
-              <w:t xml:space="preserve"> Заокружи тачан (тачне) одговор(е)</w:t>
-            </w:r>
           </w:p>
         </w:tc>
         <w:tc>
@@ -416,69 +241,6 @@
                 <w:i/>
               </w:rPr>
             </w:pPr>
-            <w:r>
-              <w:rPr>
-                <w:rFonts w:cs="Arial"/>
-                <w:i/>
-                <w:sz w:val="18"/>
-                <w:szCs w:val="18"/>
-              </w:rPr>
-              <w:fldChar w:fldCharType="begin">
-                <w:ffData>
-                  <w:name w:val="Check3"/>
-                  <w:enabled/>
-                  <w:calcOnExit w:val="0"/>
-                  <w:checkBox>
-                    <w:sizeAuto/>
-                    <w:default w:val="0"/>
-                  </w:checkBox>
-                </w:ffData>
-              </w:fldChar>
-            </w:r>
-            <w:r>
-              <w:rPr>
-                <w:rFonts w:ascii="Arial" w:hAnsi="Arial" w:cs="Arial"/>
-                <w:i/>
-                <w:sz w:val="18"/>
-                <w:szCs w:val="18"/>
-              </w:rPr>
-              <w:instrText xml:space="preserve"> FORMCHECKBOX </w:instrText>
-            </w:r>
-            <w:r>
-              <w:rPr>
-                <w:rFonts w:cs="Arial"/>
-                <w:i/>
-                <w:sz w:val="18"/>
-                <w:szCs w:val="18"/>
-              </w:rPr>
-            </w:r>
-            <w:r>
-              <w:rPr>
-                <w:rFonts w:cs="Arial"/>
-                <w:i/>
-                <w:sz w:val="18"/>
-                <w:szCs w:val="18"/>
-              </w:rPr>
-              <w:fldChar w:fldCharType="separate"/>
-            </w:r>
-            <w:r>
-              <w:rPr>
-                <w:rFonts w:cs="Arial"/>
-                <w:i/>
-                <w:sz w:val="18"/>
-                <w:szCs w:val="18"/>
-              </w:rPr>
-              <w:fldChar w:fldCharType="end"/>
-            </w:r>
-            <w:r>
-              <w:rPr>
-                <w:rFonts w:ascii="Arial" w:hAnsi="Arial" w:cs="Arial"/>
-                <w:i/>
-                <w:sz w:val="18"/>
-                <w:szCs w:val="18"/>
-              </w:rPr>
-              <w:t xml:space="preserve"> Детаљно објаснити/описати</w:t>
-            </w:r>
           </w:p>
         </w:tc>
         <w:tc>
@@ -545,69 +307,6 @@
                 <w:i/>
               </w:rPr>
             </w:pPr>
-            <w:r>
-              <w:rPr>
-                <w:rFonts w:cs="Arial"/>
-                <w:i/>
-                <w:sz w:val="18"/>
-                <w:szCs w:val="18"/>
-              </w:rPr>
-              <w:fldChar w:fldCharType="begin">
-                <w:ffData>
-                  <w:name w:val=""/>
-                  <w:enabled/>
-                  <w:calcOnExit w:val="0"/>
-                  <w:checkBox>
-                    <w:sizeAuto/>
-                    <w:default w:val="0"/>
-                  </w:checkBox>
-                </w:ffData>
-              </w:fldChar>
-            </w:r>
-            <w:r>
-              <w:rPr>
-                <w:rFonts w:cs="Arial"/>
-                <w:i/>
-                <w:sz w:val="18"/>
-                <w:szCs w:val="18"/>
-              </w:rPr>
-              <w:instrText xml:space="preserve"> FORMCHECKBOX </w:instrText>
-            </w:r>
-            <w:r>
-              <w:rPr>
-                <w:rFonts w:cs="Arial"/>
-                <w:i/>
-                <w:sz w:val="18"/>
-                <w:szCs w:val="18"/>
-              </w:rPr>
-            </w:r>
-            <w:r>
-              <w:rPr>
-                <w:rFonts w:cs="Arial"/>
-                <w:i/>
-                <w:sz w:val="18"/>
-                <w:szCs w:val="18"/>
-              </w:rPr>
-              <w:fldChar w:fldCharType="separate"/>
-            </w:r>
-            <w:r>
-              <w:rPr>
-                <w:rFonts w:cs="Arial"/>
-                <w:i/>
-                <w:sz w:val="18"/>
-                <w:szCs w:val="18"/>
-              </w:rPr>
-              <w:fldChar w:fldCharType="end"/>
-            </w:r>
-            <w:r>
-              <w:rPr>
-                <w:rFonts w:ascii="Arial" w:hAnsi="Arial" w:cs="Arial"/>
-                <w:i/>
-                <w:sz w:val="18"/>
-                <w:szCs w:val="18"/>
-              </w:rPr>
-              <w:t xml:space="preserve"> Допуни текст у реченици</w:t>
-            </w:r>
           </w:p>
         </w:tc>
         <w:tc>
@@ -627,16 +326,6 @@
                 <w:szCs w:val="20"/>
               </w:rPr>
             </w:pPr>
-            <w:r>
-              <w:rPr>
-                <w:rFonts w:ascii="Arial" w:hAnsi="Arial" w:cs="Arial"/>
-                <w:b/>
-                <w:i/>
-                <w:sz w:val="20"/>
-                <w:szCs w:val="20"/>
-              </w:rPr>
-              <w:t>Остварено</w:t>
-            </w:r>
           </w:p>
         </w:tc>
         <w:tc>
@@ -684,69 +373,6 @@
                 <w:i/>
               </w:rPr>
             </w:pPr>
-            <w:r>
-              <w:rPr>
-                <w:rFonts w:cs="Arial"/>
-                <w:i/>
-                <w:sz w:val="18"/>
-                <w:szCs w:val="18"/>
-              </w:rPr>
-              <w:fldChar w:fldCharType="begin">
-                <w:ffData>
-                  <w:name w:val=""/>
-                  <w:enabled/>
-                  <w:calcOnExit w:val="0"/>
-                  <w:checkBox>
-                    <w:sizeAuto/>
-                    <w:default w:val="0"/>
-                  </w:checkBox>
-                </w:ffData>
-              </w:fldChar>
-            </w:r>
-            <w:r>
-              <w:rPr>
-                <w:rFonts w:cs="Arial"/>
-                <w:i/>
-                <w:sz w:val="18"/>
-                <w:szCs w:val="18"/>
-              </w:rPr>
-              <w:instrText xml:space="preserve"> FORMCHECKBOX </w:instrText>
-            </w:r>
-            <w:r>
-              <w:rPr>
-                <w:rFonts w:cs="Arial"/>
-                <w:i/>
-                <w:sz w:val="18"/>
-                <w:szCs w:val="18"/>
-              </w:rPr>
-            </w:r>
-            <w:r>
-              <w:rPr>
-                <w:rFonts w:cs="Arial"/>
-                <w:i/>
-                <w:sz w:val="18"/>
-                <w:szCs w:val="18"/>
-              </w:rPr>
-              <w:fldChar w:fldCharType="separate"/>
-            </w:r>
-            <w:r>
-              <w:rPr>
-                <w:rFonts w:cs="Arial"/>
-                <w:i/>
-                <w:sz w:val="18"/>
-                <w:szCs w:val="18"/>
-              </w:rPr>
-              <w:fldChar w:fldCharType="end"/>
-            </w:r>
-            <w:r>
-              <w:rPr>
-                <w:rFonts w:ascii="Arial" w:hAnsi="Arial" w:cs="Arial"/>
-                <w:i/>
-                <w:sz w:val="18"/>
-                <w:szCs w:val="18"/>
-              </w:rPr>
-              <w:t xml:space="preserve"> Допуни празна поља у тексту/ табели/цртежу/скици</w:t>
-            </w:r>
           </w:p>
         </w:tc>
         <w:tc>
@@ -875,16 +501,6 @@
                 <w:szCs w:val="20"/>
               </w:rPr>
             </w:pPr>
-            <w:r>
-              <w:rPr>
-                <w:rFonts w:ascii="Arial" w:hAnsi="Arial" w:cs="Arial"/>
-                <w:b/>
-                <w:i/>
-                <w:sz w:val="20"/>
-                <w:szCs w:val="20"/>
-              </w:rPr>
-              <w:t>Питање/задатак</w:t>
-            </w:r>
           </w:p>
         </w:tc>
       </w:tr>
@@ -899,32 +515,32 @@
               <w:rPr>
                 <w:rFonts w:ascii="Arial" w:eastAsia="Times New Roman" w:hAnsi="Arial" w:cs="Arial"/>
                 <w:color w:val="000000"/>
-                <w:lang w:eastAsia="ja-JP"/>
+                <w:lang w:val="sr-Latn-BA" w:eastAsia="ja-JP"/>
               </w:rPr>
             </w:pPr>
             <w:r>
               <w:rPr>
                 <w:rFonts w:ascii="Arial" w:eastAsia="Times New Roman" w:hAnsi="Arial" w:cs="Arial"/>
                 <w:color w:val="000000"/>
-                <w:lang w:eastAsia="ja-JP"/>
+                <w:lang w:val="sr-Latn-BA" w:eastAsia="ja-JP"/>
               </w:rPr>
-              <w:t xml:space="preserve">Назив </w:t>
+              <w:t xml:space="preserve">Naziv </w:t>
             </w:r>
             <w:r>
               <w:rPr>
                 <w:rFonts w:ascii="Arial" w:eastAsia="Times New Roman" w:hAnsi="Arial" w:cs="Arial"/>
                 <w:color w:val="000000"/>
-                <w:lang w:eastAsia="ja-JP"/>
+                <w:lang w:val="sr-Latn-BA" w:eastAsia="ja-JP"/>
               </w:rPr>
-              <w:t>друге</w:t>
+              <w:t>druge</w:t>
             </w:r>
             <w:r>
               <w:rPr>
                 <w:rFonts w:ascii="Arial" w:eastAsia="Times New Roman" w:hAnsi="Arial" w:cs="Arial"/>
                 <w:color w:val="000000"/>
-                <w:lang w:eastAsia="ja-JP"/>
+                <w:lang w:val="sr-Latn-BA" w:eastAsia="ja-JP"/>
               </w:rPr>
-              <w:t xml:space="preserve"> области: Прво питање</w:t>
+              <w:t xml:space="preserve"> oblasti: Prvo pitanje</w:t>
             </w:r>
           </w:p>
         </w:tc>
@@ -968,16 +584,6 @@
                 <w:szCs w:val="20"/>
               </w:rPr>
             </w:pPr>
-            <w:r>
-              <w:rPr>
-                <w:rFonts w:ascii="Arial" w:hAnsi="Arial" w:cs="Arial"/>
-                <w:b/>
-                <w:i/>
-                <w:sz w:val="20"/>
-                <w:szCs w:val="20"/>
-              </w:rPr>
-              <w:t>Одговор</w:t>
-            </w:r>
           </w:p>
         </w:tc>
       </w:tr>
@@ -998,25 +604,17 @@
               <w:rPr>
                 <w:rFonts w:ascii="Arial" w:eastAsia="Times New Roman" w:hAnsi="Arial" w:cs="Arial"/>
                 <w:color w:val="000000"/>
-                <w:lang w:eastAsia="ja-JP"/>
+                <w:lang w:val="sr-Latn-BA" w:eastAsia="ja-JP"/>
               </w:rPr>
-              <w:t xml:space="preserve">Назив </w:t>
+              <w:t xml:space="preserve">Naziv </w:t>
             </w:r>
             <w:r>
               <w:rPr>
                 <w:rFonts w:ascii="Arial" w:eastAsia="Times New Roman" w:hAnsi="Arial" w:cs="Arial"/>
                 <w:color w:val="000000"/>
-                <w:lang w:eastAsia="ja-JP"/>
+                <w:lang w:val="sr-Latn-BA" w:eastAsia="ja-JP"/>
               </w:rPr>
-              <w:t>друге</w:t>
-            </w:r>
-            <w:r>
-              <w:rPr>
-                <w:rFonts w:ascii="Arial" w:eastAsia="Times New Roman" w:hAnsi="Arial" w:cs="Arial"/>
-                <w:color w:val="000000"/>
-                <w:lang w:eastAsia="ja-JP"/>
-              </w:rPr>
-              <w:t xml:space="preserve"> </w:t>
+              <w:t xml:space="preserve">druge </w:t>
             </w:r>
             <w:bookmarkStart w:id="3" w:name="_GoBack"/>
             <w:bookmarkEnd w:id="3"/>
@@ -1024,9 +622,9 @@
               <w:rPr>
                 <w:rFonts w:ascii="Arial" w:eastAsia="Times New Roman" w:hAnsi="Arial" w:cs="Arial"/>
                 <w:color w:val="000000"/>
-                <w:lang w:eastAsia="ja-JP"/>
+                <w:lang w:val="sr-Latn-BA" w:eastAsia="ja-JP"/>
               </w:rPr>
-              <w:t>области: Прво питање – одговор</w:t>
+              <w:t>oblasti: Prvo pitanje - odgovor</w:t>
             </w:r>
           </w:p>
         </w:tc>
@@ -1173,7 +771,7 @@
                 </wp:anchor>
               </w:drawing>
             </mc:Choice>
-            <mc:Fallback xmlns:w16sdtdh="http://schemas.microsoft.com/office/word/2020/wordml/sdtdatahash" xmlns:w16="http://schemas.microsoft.com/office/word/2018/wordml" xmlns:w16cid="http://schemas.microsoft.com/office/word/2016/wordml/cid" xmlns:w16cex="http://schemas.microsoft.com/office/word/2018/wordml/cex" xmlns:oel="http://schemas.microsoft.com/office/2019/extlst" xmlns:am3d="http://schemas.microsoft.com/office/drawing/2017/model3d" xmlns:aink="http://schemas.microsoft.com/office/drawing/2016/ink" xmlns:cx8="http://schemas.microsoft.com/office/drawing/2016/5/14/chartex" xmlns:cx7="http://schemas.microsoft.com/office/drawing/2016/5/13/chartex" xmlns:cx6="http://schemas.microsoft.com/office/drawing/2016/5/12/chartex" xmlns:cx5="http://schemas.microsoft.com/office/drawing/2016/5/11/chartex" xmlns:cx4="http://schemas.microsoft.com/office/drawing/2016/5/10/chartex" xmlns:cx3="http://schemas.microsoft.com/office/drawing/2016/5/9/chartex" xmlns:cx2="http://schemas.microsoft.com/office/drawing/2015/10/21/chartex" xmlns:cx1="http://schemas.microsoft.com/office/drawing/2015/9/8/chartex">
+            <mc:Fallback xmlns:cx1="http://schemas.microsoft.com/office/drawing/2015/9/8/chartex" xmlns:cx2="http://schemas.microsoft.com/office/drawing/2015/10/21/chartex" xmlns:cx3="http://schemas.microsoft.com/office/drawing/2016/5/9/chartex" xmlns:cx4="http://schemas.microsoft.com/office/drawing/2016/5/10/chartex" xmlns:cx5="http://schemas.microsoft.com/office/drawing/2016/5/11/chartex" xmlns:cx6="http://schemas.microsoft.com/office/drawing/2016/5/12/chartex" xmlns:cx7="http://schemas.microsoft.com/office/drawing/2016/5/13/chartex" xmlns:cx8="http://schemas.microsoft.com/office/drawing/2016/5/14/chartex" xmlns:aink="http://schemas.microsoft.com/office/drawing/2016/ink" xmlns:am3d="http://schemas.microsoft.com/office/drawing/2017/model3d" xmlns:oel="http://schemas.microsoft.com/office/2019/extlst" xmlns:w16cex="http://schemas.microsoft.com/office/word/2018/wordml/cex" xmlns:w16cid="http://schemas.microsoft.com/office/word/2016/wordml/cid" xmlns:w16="http://schemas.microsoft.com/office/word/2018/wordml" xmlns:w16sdtdh="http://schemas.microsoft.com/office/word/2020/wordml/sdtdatahash">
               <w:pict>
                 <v:line w14:anchorId="2ACA85AB" id="Straight Connector 5" o:spid="_x0000_s1026" style="position:absolute;flip:y;z-index:251662336;visibility:visible;mso-wrap-style:square;mso-width-percent:0;mso-height-percent:0;mso-wrap-distance-left:9pt;mso-wrap-distance-top:0;mso-wrap-distance-right:9pt;mso-wrap-distance-bottom:0;mso-position-horizontal:absolute;mso-position-horizontal-relative:margin;mso-position-vertical:absolute;mso-position-vertical-relative:text;mso-width-percent:0;mso-height-percent:0;mso-width-relative:page;mso-height-relative:page" from="-21.9pt,-1.5pt" to="472.9pt,-1.1pt" o:gfxdata="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" strokecolor="black [3200]" strokeweight="1pt">
                   <v:stroke joinstyle="miter"/>
@@ -17685,7 +17283,7 @@
 </file>
 
 <file path=customXml/itemProps1.xml><?xml version="1.0" encoding="utf-8"?>
-<ds:datastoreItem xmlns:ds="http://schemas.openxmlformats.org/officeDocument/2006/customXml" ds:itemID="{166646FA-B7FD-4715-8C52-6990838F83CB}">
+<ds:datastoreItem xmlns:ds="http://schemas.openxmlformats.org/officeDocument/2006/customXml" ds:itemID="{BC38033B-75B1-4D4F-80FC-199A84FD7872}">
   <ds:schemaRefs>
     <ds:schemaRef ds:uri="http://schemas.openxmlformats.org/officeDocument/2006/bibliography"/>
   </ds:schemaRefs>

</xml_diff>

<commit_message>
feat: update answer document fixtures
</commit_message>
<xml_diff>
--- a/tests/fixtures/baza/odgovori/ndo/1.docx
+++ b/tests/fixtures/baza/odgovori/ndo/1.docx
@@ -128,6 +128,16 @@
                 <w:szCs w:val="20"/>
               </w:rPr>
             </w:pPr>
+            <w:r>
+              <w:rPr>
+                <w:rFonts w:cs="Arial"/>
+                <w:b/>
+                <w:i/>
+                <w:sz w:val="20"/>
+                <w:szCs w:val="20"/>
+              </w:rPr>
+              <w:t>Максимално</w:t>
+            </w:r>
           </w:p>
         </w:tc>
         <w:tc>
@@ -144,8 +154,21 @@
                 <w:b/>
                 <w:sz w:val="28"/>
                 <w:szCs w:val="28"/>
+                <w:lang w:val="sr-Latn-BA"/>
               </w:rPr>
             </w:pPr>
+            <w:r>
+              <w:rPr>
+                <w:rFonts w:ascii="Arial" w:hAnsi="Arial" w:cs="Arial"/>
+                <w:b/>
+                <w:sz w:val="28"/>
+                <w:szCs w:val="28"/>
+                <w:lang w:val="sr-Latn-BA"/>
+              </w:rPr>
+              <w:t>1</w:t>
+            </w:r>
+            <w:bookmarkStart w:id="3" w:name="_GoBack"/>
+            <w:bookmarkEnd w:id="3"/>
           </w:p>
         </w:tc>
       </w:tr>
@@ -616,8 +639,6 @@
               </w:rPr>
               <w:t xml:space="preserve">druge </w:t>
             </w:r>
-            <w:bookmarkStart w:id="3" w:name="_GoBack"/>
-            <w:bookmarkEnd w:id="3"/>
             <w:r>
               <w:rPr>
                 <w:rFonts w:ascii="Arial" w:eastAsia="Times New Roman" w:hAnsi="Arial" w:cs="Arial"/>
@@ -771,7 +792,7 @@
                 </wp:anchor>
               </w:drawing>
             </mc:Choice>
-            <mc:Fallback xmlns:cx1="http://schemas.microsoft.com/office/drawing/2015/9/8/chartex" xmlns:cx2="http://schemas.microsoft.com/office/drawing/2015/10/21/chartex" xmlns:cx3="http://schemas.microsoft.com/office/drawing/2016/5/9/chartex" xmlns:cx4="http://schemas.microsoft.com/office/drawing/2016/5/10/chartex" xmlns:cx5="http://schemas.microsoft.com/office/drawing/2016/5/11/chartex" xmlns:cx6="http://schemas.microsoft.com/office/drawing/2016/5/12/chartex" xmlns:cx7="http://schemas.microsoft.com/office/drawing/2016/5/13/chartex" xmlns:cx8="http://schemas.microsoft.com/office/drawing/2016/5/14/chartex" xmlns:aink="http://schemas.microsoft.com/office/drawing/2016/ink" xmlns:am3d="http://schemas.microsoft.com/office/drawing/2017/model3d" xmlns:oel="http://schemas.microsoft.com/office/2019/extlst" xmlns:w16cex="http://schemas.microsoft.com/office/word/2018/wordml/cex" xmlns:w16cid="http://schemas.microsoft.com/office/word/2016/wordml/cid" xmlns:w16="http://schemas.microsoft.com/office/word/2018/wordml" xmlns:w16sdtdh="http://schemas.microsoft.com/office/word/2020/wordml/sdtdatahash">
+            <mc:Fallback xmlns:w16sdtdh="http://schemas.microsoft.com/office/word/2020/wordml/sdtdatahash" xmlns:w16="http://schemas.microsoft.com/office/word/2018/wordml" xmlns:w16cid="http://schemas.microsoft.com/office/word/2016/wordml/cid" xmlns:w16cex="http://schemas.microsoft.com/office/word/2018/wordml/cex" xmlns:oel="http://schemas.microsoft.com/office/2019/extlst" xmlns:am3d="http://schemas.microsoft.com/office/drawing/2017/model3d" xmlns:aink="http://schemas.microsoft.com/office/drawing/2016/ink" xmlns:cx8="http://schemas.microsoft.com/office/drawing/2016/5/14/chartex" xmlns:cx7="http://schemas.microsoft.com/office/drawing/2016/5/13/chartex" xmlns:cx6="http://schemas.microsoft.com/office/drawing/2016/5/12/chartex" xmlns:cx5="http://schemas.microsoft.com/office/drawing/2016/5/11/chartex" xmlns:cx4="http://schemas.microsoft.com/office/drawing/2016/5/10/chartex" xmlns:cx3="http://schemas.microsoft.com/office/drawing/2016/5/9/chartex" xmlns:cx2="http://schemas.microsoft.com/office/drawing/2015/10/21/chartex" xmlns:cx1="http://schemas.microsoft.com/office/drawing/2015/9/8/chartex">
               <w:pict>
                 <v:line w14:anchorId="2ACA85AB" id="Straight Connector 5" o:spid="_x0000_s1026" style="position:absolute;flip:y;z-index:251662336;visibility:visible;mso-wrap-style:square;mso-width-percent:0;mso-height-percent:0;mso-wrap-distance-left:9pt;mso-wrap-distance-top:0;mso-wrap-distance-right:9pt;mso-wrap-distance-bottom:0;mso-position-horizontal:absolute;mso-position-horizontal-relative:margin;mso-position-vertical:absolute;mso-position-vertical-relative:text;mso-width-percent:0;mso-height-percent:0;mso-width-relative:page;mso-height-relative:page" from="-21.9pt,-1.5pt" to="472.9pt,-1.1pt" o:gfxdata="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" strokecolor="black [3200]" strokeweight="1pt">
                   <v:stroke joinstyle="miter"/>
@@ -17283,7 +17304,7 @@
 </file>
 
 <file path=customXml/itemProps1.xml><?xml version="1.0" encoding="utf-8"?>
-<ds:datastoreItem xmlns:ds="http://schemas.openxmlformats.org/officeDocument/2006/customXml" ds:itemID="{BC38033B-75B1-4D4F-80FC-199A84FD7872}">
+<ds:datastoreItem xmlns:ds="http://schemas.openxmlformats.org/officeDocument/2006/customXml" ds:itemID="{8DFE4C2C-FE2E-4031-8038-160B7BE533DC}">
   <ds:schemaRefs>
     <ds:schemaRef ds:uri="http://schemas.openxmlformats.org/officeDocument/2006/bibliography"/>
   </ds:schemaRefs>

</xml_diff>

<commit_message>
feat: calculate and display total points on cover page (#17)
</commit_message>
<xml_diff>
--- a/tests/fixtures/baza/odgovori/ndo/1.docx
+++ b/tests/fixtures/baza/odgovori/ndo/1.docx
@@ -128,6 +128,16 @@
                 <w:szCs w:val="20"/>
               </w:rPr>
             </w:pPr>
+            <w:r>
+              <w:rPr>
+                <w:rFonts w:cs="Arial"/>
+                <w:b/>
+                <w:i/>
+                <w:sz w:val="20"/>
+                <w:szCs w:val="20"/>
+              </w:rPr>
+              <w:t>Максимално</w:t>
+            </w:r>
           </w:p>
         </w:tc>
         <w:tc>
@@ -144,8 +154,21 @@
                 <w:b/>
                 <w:sz w:val="28"/>
                 <w:szCs w:val="28"/>
+                <w:lang w:val="sr-Latn-BA"/>
               </w:rPr>
             </w:pPr>
+            <w:r>
+              <w:rPr>
+                <w:rFonts w:ascii="Arial" w:hAnsi="Arial" w:cs="Arial"/>
+                <w:b/>
+                <w:sz w:val="28"/>
+                <w:szCs w:val="28"/>
+                <w:lang w:val="sr-Latn-BA"/>
+              </w:rPr>
+              <w:t>1</w:t>
+            </w:r>
+            <w:bookmarkStart w:id="3" w:name="_GoBack"/>
+            <w:bookmarkEnd w:id="3"/>
           </w:p>
         </w:tc>
       </w:tr>
@@ -616,8 +639,6 @@
               </w:rPr>
               <w:t xml:space="preserve">druge </w:t>
             </w:r>
-            <w:bookmarkStart w:id="3" w:name="_GoBack"/>
-            <w:bookmarkEnd w:id="3"/>
             <w:r>
               <w:rPr>
                 <w:rFonts w:ascii="Arial" w:eastAsia="Times New Roman" w:hAnsi="Arial" w:cs="Arial"/>
@@ -771,7 +792,7 @@
                 </wp:anchor>
               </w:drawing>
             </mc:Choice>
-            <mc:Fallback xmlns:cx1="http://schemas.microsoft.com/office/drawing/2015/9/8/chartex" xmlns:cx2="http://schemas.microsoft.com/office/drawing/2015/10/21/chartex" xmlns:cx3="http://schemas.microsoft.com/office/drawing/2016/5/9/chartex" xmlns:cx4="http://schemas.microsoft.com/office/drawing/2016/5/10/chartex" xmlns:cx5="http://schemas.microsoft.com/office/drawing/2016/5/11/chartex" xmlns:cx6="http://schemas.microsoft.com/office/drawing/2016/5/12/chartex" xmlns:cx7="http://schemas.microsoft.com/office/drawing/2016/5/13/chartex" xmlns:cx8="http://schemas.microsoft.com/office/drawing/2016/5/14/chartex" xmlns:aink="http://schemas.microsoft.com/office/drawing/2016/ink" xmlns:am3d="http://schemas.microsoft.com/office/drawing/2017/model3d" xmlns:oel="http://schemas.microsoft.com/office/2019/extlst" xmlns:w16cex="http://schemas.microsoft.com/office/word/2018/wordml/cex" xmlns:w16cid="http://schemas.microsoft.com/office/word/2016/wordml/cid" xmlns:w16="http://schemas.microsoft.com/office/word/2018/wordml" xmlns:w16sdtdh="http://schemas.microsoft.com/office/word/2020/wordml/sdtdatahash">
+            <mc:Fallback xmlns:w16sdtdh="http://schemas.microsoft.com/office/word/2020/wordml/sdtdatahash" xmlns:w16="http://schemas.microsoft.com/office/word/2018/wordml" xmlns:w16cid="http://schemas.microsoft.com/office/word/2016/wordml/cid" xmlns:w16cex="http://schemas.microsoft.com/office/word/2018/wordml/cex" xmlns:oel="http://schemas.microsoft.com/office/2019/extlst" xmlns:am3d="http://schemas.microsoft.com/office/drawing/2017/model3d" xmlns:aink="http://schemas.microsoft.com/office/drawing/2016/ink" xmlns:cx8="http://schemas.microsoft.com/office/drawing/2016/5/14/chartex" xmlns:cx7="http://schemas.microsoft.com/office/drawing/2016/5/13/chartex" xmlns:cx6="http://schemas.microsoft.com/office/drawing/2016/5/12/chartex" xmlns:cx5="http://schemas.microsoft.com/office/drawing/2016/5/11/chartex" xmlns:cx4="http://schemas.microsoft.com/office/drawing/2016/5/10/chartex" xmlns:cx3="http://schemas.microsoft.com/office/drawing/2016/5/9/chartex" xmlns:cx2="http://schemas.microsoft.com/office/drawing/2015/10/21/chartex" xmlns:cx1="http://schemas.microsoft.com/office/drawing/2015/9/8/chartex">
               <w:pict>
                 <v:line w14:anchorId="2ACA85AB" id="Straight Connector 5" o:spid="_x0000_s1026" style="position:absolute;flip:y;z-index:251662336;visibility:visible;mso-wrap-style:square;mso-width-percent:0;mso-height-percent:0;mso-wrap-distance-left:9pt;mso-wrap-distance-top:0;mso-wrap-distance-right:9pt;mso-wrap-distance-bottom:0;mso-position-horizontal:absolute;mso-position-horizontal-relative:margin;mso-position-vertical:absolute;mso-position-vertical-relative:text;mso-width-percent:0;mso-height-percent:0;mso-width-relative:page;mso-height-relative:page" from="-21.9pt,-1.5pt" to="472.9pt,-1.1pt" o:gfxdata="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" strokecolor="black [3200]" strokeweight="1pt">
                   <v:stroke joinstyle="miter"/>
@@ -17283,7 +17304,7 @@
 </file>
 
 <file path=customXml/itemProps1.xml><?xml version="1.0" encoding="utf-8"?>
-<ds:datastoreItem xmlns:ds="http://schemas.openxmlformats.org/officeDocument/2006/customXml" ds:itemID="{BC38033B-75B1-4D4F-80FC-199A84FD7872}">
+<ds:datastoreItem xmlns:ds="http://schemas.openxmlformats.org/officeDocument/2006/customXml" ds:itemID="{8DFE4C2C-FE2E-4031-8038-160B7BE533DC}">
   <ds:schemaRefs>
     <ds:schemaRef ds:uri="http://schemas.openxmlformats.org/officeDocument/2006/bibliography"/>
   </ds:schemaRefs>

</xml_diff>